<commit_message>
test del modulo deadlock con documentazione
</commit_message>
<xml_diff>
--- a/progettazione/1.DettagliSistema.docx
+++ b/progettazione/1.DettagliSistema.docx
@@ -24,6 +24,9 @@
     </w:p>
     <w:p>
       <w:r>
+        <w:rPr>
+          <w:noProof/>
+        </w:rPr>
         <w:drawing>
           <wp:inline distT="0" distB="0" distL="0" distR="0" wp14:anchorId="13C1FF36" wp14:editId="304D39FE">
             <wp:extent cx="6161674" cy="3821679"/>
@@ -409,6 +412,9 @@
         <w:pStyle w:val="Paragrafoelenco"/>
       </w:pPr>
       <w:r>
+        <w:rPr>
+          <w:noProof/>
+        </w:rPr>
         <w:drawing>
           <wp:inline distT="0" distB="0" distL="0" distR="0" wp14:anchorId="40CCAD6D" wp14:editId="2E6212CF">
             <wp:extent cx="2476919" cy="886236"/>
@@ -478,6 +484,9 @@
         <w:pStyle w:val="Paragrafoelenco"/>
       </w:pPr>
       <w:r>
+        <w:rPr>
+          <w:noProof/>
+        </w:rPr>
         <w:drawing>
           <wp:inline distT="0" distB="0" distL="0" distR="0" wp14:anchorId="59726F49" wp14:editId="13C64081">
             <wp:extent cx="2481943" cy="933575"/>
@@ -1219,13 +1228,6 @@
       </w:r>
     </w:p>
     <w:p>
-      <w:r>
-        <w:pict w14:anchorId="43F27D35">
-          <v:rect id="_x0000_i1054" style="width:0;height:1.5pt" o:hralign="center" o:hrstd="t" o:hr="t" fillcolor="#a0a0a0" stroked="f"/>
-        </w:pict>
-      </w:r>
-    </w:p>
-    <w:p>
       <w:pPr>
         <w:pStyle w:val="Paragrafoelenco"/>
         <w:numPr>
@@ -1283,19 +1285,6 @@
           <w:szCs w:val="20"/>
         </w:rPr>
         <w:t xml:space="preserve">il sistema deve continuare a produrre indefinitamente </w:t>
-      </w:r>
-    </w:p>
-    <w:p>
-      <w:pPr>
-        <w:rPr>
-          <w:sz w:val="20"/>
-          <w:szCs w:val="20"/>
-        </w:rPr>
-      </w:pPr>
-      <w:r>
-        <w:pict w14:anchorId="2E735DE5">
-          <v:rect id="_x0000_i1065" style="width:0;height:1.5pt" o:hralign="center" o:hrstd="t" o:hr="t" fillcolor="#a0a0a0" stroked="f"/>
-        </w:pict>
       </w:r>
     </w:p>
     <w:p>
@@ -4450,6 +4439,7 @@
   <w:style w:type="character" w:default="1" w:styleId="Carpredefinitoparagrafo">
     <w:name w:val="Default Paragraph Font"/>
     <w:uiPriority w:val="1"/>
+    <w:semiHidden/>
     <w:unhideWhenUsed/>
   </w:style>
   <w:style w:type="table" w:default="1" w:styleId="Tabellanormale">

</xml_diff>